<commit_message>
docs(intermodular): polish Tarea 0 files with student name and natural voice
</commit_message>
<xml_diff>
--- a/Proyecto intermodular/UD1/Tarea0-2DAM/Tarea0_Memorix_Kevin.docx
+++ b/Proyecto intermodular/UD1/Tarea0-2DAM/Tarea0_Memorix_Kevin.docx
@@ -4,12 +4,12 @@
   <w:body>
     <w:p>
       <w:pPr>
-        <w:spacing w:before="400"/>
+        <w:spacing w:before="500"/>
       </w:pPr>
     </w:p>
     <w:p>
       <w:pPr>
-        <w:spacing w:after="160"/>
+        <w:spacing w:after="200"/>
         <w:jc w:val="center"/>
       </w:pPr>
       <w:r>
@@ -56,7 +56,7 @@
         <w:rPr>
           <w:rFonts w:ascii="Calibri" w:hAnsi="Calibri"/>
           <w:b/>
-          <w:color w:val="00A896"/>
+          <w:color w:val="009688"/>
           <w:sz w:val="22"/>
         </w:rPr>
         <w:t>PROYECTO INTERMODULAR • 2º DAM</w:t>
@@ -79,7 +79,7 @@
     </w:p>
     <w:p>
       <w:pPr>
-        <w:spacing w:after="280" w:line="288" w:lineRule="auto"/>
+        <w:spacing w:after="320" w:line="288" w:lineRule="auto"/>
         <w:jc w:val="center"/>
       </w:pPr>
       <w:r>
@@ -89,24 +89,24 @@
           <w:color w:val="0038FF"/>
           <w:sz w:val="26"/>
         </w:rPr>
-        <w:t>Asistente Móvil Inteligente de Tratamientos Farmacológicos y Rehabilitación Muscular Asistida</w:t>
+        <w:t>Asistente Móvil de Tratamientos Farmacológicos y Rehabilitación Muscular Guiada</w:t>
       </w:r>
     </w:p>
     <w:p>
       <w:pPr>
-        <w:spacing w:after="360"/>
+        <w:spacing w:after="320"/>
         <w:jc w:val="center"/>
       </w:pPr>
       <w:r>
         <w:rPr>
           <w:color w:val="CBD5E1"/>
         </w:rPr>
-        <w:t>————————————————————————————————</w:t>
+        <w:t>——————————————————————————————</w:t>
       </w:r>
     </w:p>
     <w:p>
       <w:pPr>
-        <w:spacing w:after="1200" w:line="312" w:lineRule="auto"/>
+        <w:spacing w:after="1400" w:line="312" w:lineRule="auto"/>
         <w:jc w:val="center"/>
       </w:pPr>
       <w:r>
@@ -130,13 +130,13 @@
           <w:b/>
           <w:sz w:val="24"/>
         </w:rPr>
-        <w:t xml:space="preserve">Alumno: </w:t>
+        <w:t xml:space="preserve">Nombre y apellidos: </w:t>
       </w:r>
       <w:r>
         <w:rPr>
           <w:sz w:val="24"/>
         </w:rPr>
-        <w:t>Kevin [Apellidos]</w:t>
+        <w:t>Kevin Muñoz Córcoles</w:t>
         <w:br/>
       </w:r>
       <w:r>
@@ -176,7 +176,7 @@
       <w:bookmarkStart w:id="1" w:name="toc"/>
       <w:pPr>
         <w:keepNext/>
-        <w:spacing w:before="160" w:after="40" w:line="276" w:lineRule="auto"/>
+        <w:spacing w:before="0" w:after="60" w:line="276" w:lineRule="auto"/>
       </w:pPr>
       <w:r>
         <w:rPr>
@@ -191,7 +191,7 @@
     </w:p>
     <w:p>
       <w:pPr>
-        <w:spacing w:line="288" w:lineRule="auto" w:after="40"/>
+        <w:spacing w:line="276" w:lineRule="auto" w:after="40"/>
       </w:pPr>
       <w:hyperlink w:anchor="sec_problema" w:history="1">
         <w:r>
@@ -209,7 +209,7 @@
           <w:color w:val="A0AEC0"/>
           <w:sz w:val="22"/>
         </w:rPr>
-        <w:t xml:space="preserve">  ..............................................  </w:t>
+        <w:t xml:space="preserve">  ............................................  </w:t>
       </w:r>
       <w:r>
         <w:rPr>
@@ -223,7 +223,7 @@
     </w:p>
     <w:p>
       <w:pPr>
-        <w:spacing w:line="288" w:lineRule="auto" w:after="40"/>
+        <w:spacing w:line="276" w:lineRule="auto" w:after="40"/>
       </w:pPr>
       <w:hyperlink w:anchor="sec_solucion" w:history="1">
         <w:r>
@@ -232,7 +232,7 @@
             <w:color w:val="050C26"/>
             <w:u w:val="single"/>
           </w:rPr>
-          <w:t>2. Solución Digital: Memorix</w:t>
+          <w:t>2. Propuesta de Solución Digital: Memorix</w:t>
         </w:r>
       </w:hyperlink>
       <w:r>
@@ -241,7 +241,7 @@
           <w:color w:val="A0AEC0"/>
           <w:sz w:val="22"/>
         </w:rPr>
-        <w:t xml:space="preserve">  ..............................................  </w:t>
+        <w:t xml:space="preserve">  ............................................  </w:t>
       </w:r>
       <w:r>
         <w:rPr>
@@ -255,7 +255,7 @@
     </w:p>
     <w:p>
       <w:pPr>
-        <w:spacing w:line="288" w:lineRule="auto" w:after="40"/>
+        <w:spacing w:line="276" w:lineRule="auto" w:after="40"/>
       </w:pPr>
       <w:hyperlink w:anchor="sec_funcionalidades" w:history="1">
         <w:r>
@@ -264,7 +264,7 @@
             <w:color w:val="050C26"/>
             <w:u w:val="single"/>
           </w:rPr>
-          <w:t>3. Funcionalidades de la Propuesta</w:t>
+          <w:t>3. Funcionalidades del Sistema</w:t>
         </w:r>
       </w:hyperlink>
       <w:r>
@@ -273,7 +273,7 @@
           <w:color w:val="A0AEC0"/>
           <w:sz w:val="22"/>
         </w:rPr>
-        <w:t xml:space="preserve">  ..............................................  </w:t>
+        <w:t xml:space="preserve">  ............................................  </w:t>
       </w:r>
       <w:r>
         <w:rPr>
@@ -287,7 +287,7 @@
     </w:p>
     <w:p>
       <w:pPr>
-        <w:spacing w:line="288" w:lineRule="auto" w:after="40"/>
+        <w:spacing w:line="276" w:lineRule="auto" w:after="40"/>
       </w:pPr>
       <w:hyperlink w:anchor="sec_mejora" w:history="1">
         <w:r>
@@ -305,7 +305,7 @@
           <w:color w:val="A0AEC0"/>
           <w:sz w:val="22"/>
         </w:rPr>
-        <w:t xml:space="preserve">  ..............................................  </w:t>
+        <w:t xml:space="preserve">  ............................................  </w:t>
       </w:r>
       <w:r>
         <w:rPr>
@@ -319,7 +319,7 @@
     </w:p>
     <w:p>
       <w:pPr>
-        <w:spacing w:line="288" w:lineRule="auto" w:after="40"/>
+        <w:spacing w:line="276" w:lineRule="auto" w:after="40"/>
       </w:pPr>
       <w:hyperlink w:anchor="sec_imagen" w:history="1">
         <w:r>
@@ -328,7 +328,7 @@
             <w:color w:val="050C26"/>
             <w:u w:val="single"/>
           </w:rPr>
-          <w:t>5. Identidad Visual y Prototipo</w:t>
+          <w:t>5. Prototipo e Identidad Visual</w:t>
         </w:r>
       </w:hyperlink>
       <w:r>
@@ -337,7 +337,7 @@
           <w:color w:val="A0AEC0"/>
           <w:sz w:val="22"/>
         </w:rPr>
-        <w:t xml:space="preserve">  ..............................................  </w:t>
+        <w:t xml:space="preserve">  ............................................  </w:t>
       </w:r>
       <w:r>
         <w:rPr>
@@ -351,7 +351,7 @@
     </w:p>
     <w:p>
       <w:pPr>
-        <w:spacing w:line="288" w:lineRule="auto" w:after="40"/>
+        <w:spacing w:line="276" w:lineRule="auto" w:after="40"/>
       </w:pPr>
       <w:hyperlink w:anchor="sec_fuentes" w:history="1">
         <w:r>
@@ -369,7 +369,7 @@
           <w:color w:val="A0AEC0"/>
           <w:sz w:val="22"/>
         </w:rPr>
-        <w:t xml:space="preserve">  ..............................................  </w:t>
+        <w:t xml:space="preserve">  ............................................  </w:t>
       </w:r>
       <w:r>
         <w:rPr>
@@ -407,7 +407,7 @@
         <w:rPr>
           <w:rFonts w:ascii="Calibri" w:hAnsi="Calibri"/>
           <w:b/>
-          <w:color w:val="00A896"/>
+          <w:color w:val="009688"/>
           <w:sz w:val="24"/>
         </w:rPr>
         <w:t xml:space="preserve">• ¿Qué ocurre? </w:t>
@@ -415,10 +415,10 @@
       <w:r>
         <w:rPr>
           <w:rFonts w:ascii="Calibri" w:hAnsi="Calibri"/>
-          <w:color w:val="1E293B"/>
+          <w:color w:val="28323C"/>
           <w:sz w:val="24"/>
         </w:rPr>
-        <w:t>El incumplimiento terapéutico constituye una de las mayores crisis silenciosas de la salud pública. En pacientes con tratamientos continuados, es habitual olvidar tomas, confundir posologías o abandonar medicamentos esenciales por incomprensión de las instrucciones. De forma paralela, las personas que sufren traumatismos o dolor muscular no realizan su rehabilitación física domiciliaria porque las pautas en papel se extravían o no garantizan una postura correcta.</w:t>
+        <w:t>El problema principal que he detectado surge de dos dificultades muy habituales en la vida diaria: los olvidos en la medicación y el abandono de la rehabilitación física en casa. En tratamientos de media o larga duración, muchas personas olvidan tomas o confunden las horas, lo que hace que los medicamentos no hagan el efecto deseado. Además, los prospectos médicos suelen tener una letra diminuta y explicaciones técnicas difíciles de entender para la mayoría de la gente. Al mismo tiempo, cuando una persona sufre una lesión muscular, un esguince o dolores de espalda por malas posturas o traumatismos, el médico o fisioterapeuta suele darle una hoja de papel con ejercicios para hacer en casa. En la práctica, esa hoja casi siempre termina perdiéndose o el paciente no recuerda bien cómo hacer el movimiento, por lo que acaba dejando de hacerlos y la recuperación se alarga.</w:t>
       </w:r>
     </w:p>
     <w:p>
@@ -430,7 +430,7 @@
         <w:rPr>
           <w:rFonts w:ascii="Calibri" w:hAnsi="Calibri"/>
           <w:b/>
-          <w:color w:val="00A896"/>
+          <w:color w:val="009688"/>
           <w:sz w:val="24"/>
         </w:rPr>
         <w:t xml:space="preserve">• ¿A quién afecta? </w:t>
@@ -438,10 +438,10 @@
       <w:r>
         <w:rPr>
           <w:rFonts w:ascii="Calibri" w:hAnsi="Calibri"/>
-          <w:color w:val="1E293B"/>
+          <w:color w:val="28323C"/>
           <w:sz w:val="24"/>
         </w:rPr>
-        <w:t>Afecta principalmente a personas mayores con polimedicación y a pacientes con fases tempranas de Alzheimer o deterioro cognitivo leve. Asimismo, genera una severa sobrecarga mental en cuidadores y familiares, obligados a supervisar las tomas diarias sin herramientas automáticas. En el plano motriz, afecta a deportistas, trabajadores sedentarios y personas en recuperación de lesiones traumatológicas.</w:t>
+        <w:t>Esta situación afecta de forma directa a personas mayores que toman varias pastillas al día y a pacientes en fases iniciales de Alzheimer o deterioro cognitivo leve, que todavía mantienen autonomía en casa pero necesitan ayuda para no equivocarse. También repercute intensamente en sus familiares y cuidadores, que sufren la preocupación constante de no saber si se han tomado las pastillas a tiempo. En la parte física, afecta a deportistas, trabajadores con sobrecargas o cualquier persona en recuperación de un traumatismo que necesita fortalecer músculos específicos.</w:t>
       </w:r>
     </w:p>
     <w:p>
@@ -453,18 +453,18 @@
         <w:rPr>
           <w:rFonts w:ascii="Calibri" w:hAnsi="Calibri"/>
           <w:b/>
-          <w:color w:val="00A896"/>
+          <w:color w:val="009688"/>
           <w:sz w:val="24"/>
         </w:rPr>
-        <w:t xml:space="preserve">• ¿Por qué puede mejorarse y ODS? </w:t>
+        <w:t xml:space="preserve">• ¿Por qué debería mejorarse? </w:t>
       </w:r>
       <w:r>
         <w:rPr>
           <w:rFonts w:ascii="Calibri" w:hAnsi="Calibri"/>
-          <w:color w:val="1E293B"/>
+          <w:color w:val="28323C"/>
           <w:sz w:val="24"/>
         </w:rPr>
-        <w:t>El teléfono móvil permite sustituir la incertidumbre del papel por alarmas habladas, confirmaciones táctiles simples e interfaces de máximo contraste visual (Modo Memorix). La propuesta impacta de lleno en el ODS 3 (Salud y Bienestar) al prevenir ingresos hospitalarios por error farmacológico y acelerar la recuperación física, y en el ODS 10 (Reducción de las Desigualdades) al eliminar la brecha digital en personas mayores.</w:t>
+        <w:t>Conviene mejorar esta situación porque un error en la dosis o una toma omitida de medicamentos para la tensión o el corazón puede provocar un ingreso hospitalario evitable. En el plano físico, no realizar bien la rehabilitación puede cronificar una lesión. Hoy en día casi todo el mundo tiene un móvil a mano, por lo que podemos sustituir los papeles y los pastilleros de plástico por una herramienta accesible con avisos sonoros hablados y vídeos sencillos de ejercicios. Esta propuesta conecta directamente con el ODS 3 (Salud y Bienestar) y el ODS 10 (Reducción de las Desigualdades).</w:t>
       </w:r>
     </w:p>
     <w:p>
@@ -480,7 +480,7 @@
           <w:color w:val="050C26"/>
           <w:sz w:val="28"/>
         </w:rPr>
-        <w:t>2. Solución Digital: Memorix</w:t>
+        <w:t>2. Propuesta de Solución Digital: Memorix</w:t>
       </w:r>
       <w:bookmarkEnd w:id="3"/>
     </w:p>
@@ -493,7 +493,7 @@
         <w:rPr>
           <w:rFonts w:ascii="Calibri" w:hAnsi="Calibri"/>
           <w:b/>
-          <w:color w:val="00A896"/>
+          <w:color w:val="009688"/>
           <w:sz w:val="24"/>
         </w:rPr>
         <w:t xml:space="preserve">• Explicación de la idea: </w:t>
@@ -501,10 +501,10 @@
       <w:r>
         <w:rPr>
           <w:rFonts w:ascii="Calibri" w:hAnsi="Calibri"/>
-          <w:color w:val="1E293B"/>
+          <w:color w:val="28323C"/>
           <w:sz w:val="24"/>
         </w:rPr>
-        <w:t>Memorix es una aplicación móvil multiplataforma (Android e iOS) concebida como un copiloto de salud accesible que fusiona la disciplina del tratamiento farmacológico con la actividad física de rehabilitación motriz en un entorno gráfico de alta visibilidad.</w:t>
+        <w:t>Memorix es una aplicación móvil multiplataforma (diseñada para Android e iOS) pensada específicamente para ser muy intuitiva y limpia. Integra en un mismo lugar la gestión de los tratamientos farmacológicos diarios y una guía de ejercicios activos de fortalecimiento muscular, todo ello bajo una interfaz adaptada con botones grandes y colores de alto contraste que facilitan su lectura a personas con dificultades visuales o mayores.</w:t>
       </w:r>
     </w:p>
     <w:p>
@@ -516,7 +516,7 @@
         <w:rPr>
           <w:rFonts w:ascii="Calibri" w:hAnsi="Calibri"/>
           <w:b/>
-          <w:color w:val="00A896"/>
+          <w:color w:val="009688"/>
           <w:sz w:val="24"/>
         </w:rPr>
         <w:t xml:space="preserve">• ¿Qué permitiría hacer? </w:t>
@@ -524,10 +524,10 @@
       <w:r>
         <w:rPr>
           <w:rFonts w:ascii="Calibri" w:hAnsi="Calibri"/>
-          <w:color w:val="1E293B"/>
+          <w:color w:val="28323C"/>
           <w:sz w:val="24"/>
         </w:rPr>
-        <w:t>Memorix programa alarmas prioritarias que leen en voz alta el nombre del medicamento, dosis y pauta de ingesta (ej. 'tomar con agua tras la comida'). Dispone de confirmación de un solo toque y alerta diferida automática al cuidador ante retrasos. En paralelo, integra un entrenador de fisioterapia con rutinas visuales, temporizador guiado y ejercicios específicos para tonificar músculos lesionados o aliviar dolores musculares.</w:t>
+        <w:t>La aplicación permite registrar la medicación con alarmas que suenan de forma clara y que además reproducen por voz qué pastilla toca y cómo tomarla (por ejemplo: 'Toca tomar Enalapril, una pastilla con un vaso de agua después de comer'). Incluye un botón grande para confirmar la toma y avisa automáticamente al cuidador si pasan más de 20 minutos sin confirmarse. En la parte física, ofrece un catálogo de ejercicios guiados con temporizador y demostraciones visuales para zonas concretas como hombros, espalda, cuello o piernas tras un traumatismo o sobrecarga.</w:t>
       </w:r>
     </w:p>
     <w:p>
@@ -539,18 +539,18 @@
         <w:rPr>
           <w:rFonts w:ascii="Calibri" w:hAnsi="Calibri"/>
           <w:b/>
-          <w:color w:val="00A896"/>
+          <w:color w:val="009688"/>
           <w:sz w:val="24"/>
         </w:rPr>
-        <w:t xml:space="preserve">• ¿Quién utilizaría la aplicación? </w:t>
+        <w:t xml:space="preserve">• ¿Quién utilizaría la solución? </w:t>
       </w:r>
       <w:r>
         <w:rPr>
           <w:rFonts w:ascii="Calibri" w:hAnsi="Calibri"/>
-          <w:color w:val="1E293B"/>
+          <w:color w:val="28323C"/>
           <w:sz w:val="24"/>
         </w:rPr>
-        <w:t>1) Pacientes senior o con problemas de memoria (interfaz 'Modo Fácil' de alto contraste); 2) Usuarios en rehabilitación muscular o con dolores de espalda/cuello; 3) Cuidadores y familiares que requieren tele-supervisión tranquila y eficaz.</w:t>
+        <w:t>La utilizarán principalmente: 1) Personas mayores o con despistes frecuentes que necesitan un recordatorio claro; 2) Cuidadores y familiares que supervisan a distancia el cumplimiento del tratamiento; 3) Personas de cualquier edad en recuperación física que necesitan tablas guiadas de ejercicios musculares para hacer en su domicilio.</w:t>
       </w:r>
     </w:p>
     <w:p>
@@ -562,7 +562,7 @@
       <w:bookmarkStart w:id="4" w:name="sec_funcionalidades"/>
       <w:pPr>
         <w:keepNext/>
-        <w:spacing w:before="160" w:after="40" w:line="276" w:lineRule="auto"/>
+        <w:spacing w:before="0" w:after="40" w:line="276" w:lineRule="auto"/>
       </w:pPr>
       <w:r>
         <w:rPr>
@@ -571,7 +571,7 @@
           <w:color w:val="050C26"/>
           <w:sz w:val="28"/>
         </w:rPr>
-        <w:t>3. Funcionalidades de la Propuesta</w:t>
+        <w:t>3. Funcionalidades del Sistema</w:t>
       </w:r>
       <w:bookmarkEnd w:id="4"/>
     </w:p>
@@ -602,7 +602,7 @@
           </w:tcPr>
           <w:p>
             <w:pPr>
-              <w:spacing w:before="60" w:after="60"/>
+              <w:spacing w:before="50" w:after="50"/>
               <w:jc w:val="left"/>
             </w:pPr>
             <w:r>
@@ -610,7 +610,7 @@
                 <w:rFonts w:ascii="Calibri" w:hAnsi="Calibri"/>
                 <w:b/>
                 <w:color w:val="FFFFFF"/>
-                <w:sz w:val="22"/>
+                <w:sz w:val="21"/>
               </w:rPr>
               <w:t>Funcionalidad</w:t>
             </w:r>
@@ -623,7 +623,7 @@
           </w:tcPr>
           <w:p>
             <w:pPr>
-              <w:spacing w:before="60" w:after="60"/>
+              <w:spacing w:before="50" w:after="50"/>
               <w:jc w:val="left"/>
             </w:pPr>
             <w:r>
@@ -631,7 +631,7 @@
                 <w:rFonts w:ascii="Calibri" w:hAnsi="Calibri"/>
                 <w:b/>
                 <w:color w:val="FFFFFF"/>
-                <w:sz w:val="22"/>
+                <w:sz w:val="21"/>
               </w:rPr>
               <w:t>Descripción</w:t>
             </w:r>
@@ -655,7 +655,7 @@
                 <w:color w:val="1E293B"/>
                 <w:sz w:val="20"/>
               </w:rPr>
-              <w:t>Registro y Perfil Dual</w:t>
+              <w:t>Perfiles de Paciente y Cuidador</w:t>
             </w:r>
           </w:p>
         </w:tc>
@@ -674,7 +674,7 @@
                 <w:color w:val="1E293B"/>
                 <w:sz w:val="20"/>
               </w:rPr>
-              <w:t>Configuración de perfiles adaptados: modo autónomo, modo asistido (para mayores) y perfil de cuidador supervisor.</w:t>
+              <w:t>Permite configurar un modo fácil para el paciente y vincularlo con el móvil del familiar para supervisión a distancia.</w:t>
             </w:r>
           </w:p>
         </w:tc>
@@ -715,7 +715,7 @@
                 <w:color w:val="1E293B"/>
                 <w:sz w:val="20"/>
               </w:rPr>
-              <w:t>Avisos sonoros que reproducen por síntesis de voz el nombre del fármaco, dosis e instrucciones comprensibles.</w:t>
+              <w:t>Avisos sonoros que leen en voz alta el nombre del medicamento, la dosis y consejos claros de toma (ej. tomar con comida).</w:t>
             </w:r>
           </w:p>
         </w:tc>
@@ -737,7 +737,7 @@
                 <w:color w:val="1E293B"/>
                 <w:sz w:val="20"/>
               </w:rPr>
-              <w:t>Confirmación y Antiolvido</w:t>
+              <w:t>Confirmación de Toma y Registro</w:t>
             </w:r>
           </w:p>
         </w:tc>
@@ -756,7 +756,7 @@
                 <w:color w:val="1E293B"/>
                 <w:sz w:val="20"/>
               </w:rPr>
-              <w:t>Botón táctil de gran formato para confirmar la ingesta; registra hora exacta para evitar dosis duplicadas.</w:t>
+              <w:t>Botón táctil grande para confirmar la ingesta; guarda la hora exacta para evitar tomas dobles accidentales.</w:t>
             </w:r>
           </w:p>
         </w:tc>
@@ -778,7 +778,7 @@
                 <w:color w:val="1E293B"/>
                 <w:sz w:val="20"/>
               </w:rPr>
-              <w:t>Alerta SOS a Cuidadores</w:t>
+              <w:t>Aviso de Seguridad al Cuidador</w:t>
             </w:r>
           </w:p>
         </w:tc>
@@ -797,7 +797,7 @@
                 <w:color w:val="1E293B"/>
                 <w:sz w:val="20"/>
               </w:rPr>
-              <w:t>Si tras 20 minutos no se confirma una toma prioritaria, Memorix avisa por notificación push o SMS al contacto asignado.</w:t>
+              <w:t>Envía una alerta automática al móvil del cuidador si pasan 20 minutos desde la alarma sin confirmación de la toma.</w:t>
             </w:r>
           </w:p>
         </w:tc>
@@ -819,7 +819,7 @@
                 <w:color w:val="1E293B"/>
                 <w:sz w:val="20"/>
               </w:rPr>
-              <w:t>Módulo de Fisioterapia Activa</w:t>
+              <w:t>Ejercicios Musculares Guiados</w:t>
             </w:r>
           </w:p>
         </w:tc>
@@ -838,7 +838,7 @@
                 <w:color w:val="1E293B"/>
                 <w:sz w:val="20"/>
               </w:rPr>
-              <w:t>Catálogo interactivo con rutinas visuales para dolor lumbar, hombro, rodilla o cuello con conteo de series y descanso.</w:t>
+              <w:t>Rutinas visuales para dolores o traumatismos (cuello, espalda, hombro, pierna) con temporizador, series y descansos.</w:t>
             </w:r>
           </w:p>
         </w:tc>
@@ -860,7 +860,7 @@
                 <w:color w:val="1E293B"/>
                 <w:sz w:val="20"/>
               </w:rPr>
-              <w:t>Prospecto Accesible</w:t>
+              <w:t>Modo Contraste Accesible</w:t>
             </w:r>
           </w:p>
         </w:tc>
@@ -879,48 +879,7 @@
                 <w:color w:val="1E293B"/>
                 <w:sz w:val="20"/>
               </w:rPr>
-              <w:t>Resumen claro sin tecnicismos que indica la función del fármaco, advertencias y alimentos incompatibles.</w:t>
-            </w:r>
-          </w:p>
-        </w:tc>
-      </w:tr>
-      <w:tr>
-        <w:tc>
-          <w:tcPr>
-            <w:tcW w:type="dxa" w:w="3168"/>
-            <w:shd w:fill="F1F5F9"/>
-          </w:tcPr>
-          <w:p>
-            <w:pPr>
-              <w:spacing w:line="276" w:lineRule="auto" w:before="40" w:after="40"/>
-            </w:pPr>
-            <w:r>
-              <w:rPr>
-                <w:rFonts w:ascii="Calibri" w:hAnsi="Calibri"/>
-                <w:b/>
-                <w:color w:val="1E293B"/>
-                <w:sz w:val="20"/>
-              </w:rPr>
-              <w:t>Modo Contraste Accesible</w:t>
-            </w:r>
-          </w:p>
-        </w:tc>
-        <w:tc>
-          <w:tcPr>
-            <w:tcW w:type="dxa" w:w="6480"/>
-            <w:shd w:fill="F1F5F9"/>
-          </w:tcPr>
-          <w:p>
-            <w:pPr>
-              <w:spacing w:line="276" w:lineRule="auto" w:before="40" w:after="40"/>
-            </w:pPr>
-            <w:r>
-              <w:rPr>
-                <w:rFonts w:ascii="Calibri" w:hAnsi="Calibri"/>
-                <w:color w:val="1E293B"/>
-                <w:sz w:val="20"/>
-              </w:rPr>
-              <w:t>Temas cromáticos optimizados (azul profundo, cian, menta y blanco) diseñados para máxima legibilidad visual (WCAG).</w:t>
+              <w:t>Esquemas de color de alto contraste (azul marino, cian, menta y blanco) diseñados para máxima legibilidad visual.</w:t>
             </w:r>
           </w:p>
         </w:tc>
@@ -930,7 +889,7 @@
       <w:bookmarkStart w:id="5" w:name="sec_mejora"/>
       <w:pPr>
         <w:keepNext/>
-        <w:spacing w:before="160" w:after="40" w:line="276" w:lineRule="auto"/>
+        <w:spacing w:before="120" w:after="40" w:line="276" w:lineRule="auto"/>
       </w:pPr>
       <w:r>
         <w:rPr>
@@ -952,25 +911,25 @@
         <w:rPr>
           <w:rFonts w:ascii="Calibri" w:hAnsi="Calibri"/>
           <w:b/>
-          <w:color w:val="00A896"/>
+          <w:color w:val="009688"/>
           <w:sz w:val="24"/>
         </w:rPr>
-        <w:t xml:space="preserve">• Evolución del sistema: </w:t>
+        <w:t xml:space="preserve">• Evolución prevista: </w:t>
       </w:r>
       <w:r>
         <w:rPr>
           <w:rFonts w:ascii="Calibri" w:hAnsi="Calibri"/>
-          <w:color w:val="1E293B"/>
+          <w:color w:val="28323C"/>
           <w:sz w:val="24"/>
         </w:rPr>
-        <w:t>Como salto tecnológico se incorporará Visión por Computador (Computer Vision) mediante la cámara frontal para evaluar la ejecución de los ejercicios de rehabilitación y corregir la postura en directo. Además, se integrará con pulseras inteligentes (vibración háptica y detección de caídas), pastilleros IoT con apertura inteligente y sincronización con los sistemas de receta electrónica autonómicos.</w:t>
+        <w:t>Como mejora futura para más adelante, la idea es incorporar visión artificial (Computer Vision) usando la cámara frontal del teléfono. De este modo, mientras el paciente realiza los ejercicios de rehabilitación delante del móvil, la aplicación podrá evaluar en tiempo real la postura del cuerpo y avisarle por voz si está curvando mal la espalda o forzando la articulación, evitando nuevas lesiones. Además, se contempla la vinculación con pulseras inteligentes (smartwatch) para avisar de las pastillas mediante vibración en la muñeca y detectar posibles caídas en personas mayores.</w:t>
       </w:r>
     </w:p>
     <w:p>
       <w:bookmarkStart w:id="6" w:name="sec_imagen"/>
       <w:pPr>
         <w:keepNext/>
-        <w:spacing w:before="160" w:after="40" w:line="276" w:lineRule="auto"/>
+        <w:spacing w:before="120" w:after="40" w:line="276" w:lineRule="auto"/>
       </w:pPr>
       <w:r>
         <w:rPr>
@@ -979,19 +938,19 @@
           <w:color w:val="050C26"/>
           <w:sz w:val="28"/>
         </w:rPr>
-        <w:t>5. Identidad Visual y Prototipo de la Propuesta</w:t>
+        <w:t>5. Prototipo e Identidad Visual de la Propuesta</w:t>
       </w:r>
       <w:bookmarkEnd w:id="6"/>
     </w:p>
     <w:p>
       <w:pPr>
-        <w:spacing w:before="60" w:after="40"/>
+        <w:spacing w:before="40" w:after="20"/>
         <w:jc w:val="center"/>
       </w:pPr>
       <w:r>
         <w:drawing>
           <wp:inline xmlns:a="http://schemas.openxmlformats.org/drawingml/2006/main" xmlns:pic="http://schemas.openxmlformats.org/drawingml/2006/picture">
-            <wp:extent cx="4206240" cy="2347669"/>
+            <wp:extent cx="3474720" cy="1939379"/>
             <wp:docPr id="2" name="Picture 2"/>
             <wp:cNvGraphicFramePr>
               <a:graphicFrameLocks noChangeAspect="1"/>
@@ -1012,7 +971,7 @@
                   <pic:spPr>
                     <a:xfrm>
                       <a:off x="0" y="0"/>
-                      <a:ext cx="4206240" cy="2347669"/>
+                      <a:ext cx="3474720" cy="1939379"/>
                     </a:xfrm>
                     <a:prstGeom prst="rect"/>
                   </pic:spPr>
@@ -1033,16 +992,16 @@
           <w:rFonts w:ascii="Calibri" w:hAnsi="Calibri"/>
           <w:i/>
           <w:color w:val="64748B"/>
-          <w:sz w:val="18"/>
+          <w:sz w:val="17"/>
         </w:rPr>
-        <w:t>Figura 1: Prototipo funcional de Memorix (Alarma con audio-guía y sesión de ejercicios guiados).</w:t>
+        <w:t>Figura 1: Prototipo de Memorix mostrando la alarma con audio-guía y la rutina de ejercicios con temporizador.</w:t>
       </w:r>
     </w:p>
     <w:p>
       <w:bookmarkStart w:id="7" w:name="sec_fuentes"/>
       <w:pPr>
         <w:keepNext/>
-        <w:spacing w:before="160" w:after="40" w:line="276" w:lineRule="auto"/>
+        <w:spacing w:before="100" w:after="40" w:line="276" w:lineRule="auto"/>
       </w:pPr>
       <w:r>
         <w:rPr>
@@ -1057,13 +1016,13 @@
     </w:p>
     <w:p>
       <w:pPr>
-        <w:spacing w:line="276" w:lineRule="auto" w:after="40"/>
+        <w:spacing w:line="276" w:lineRule="auto" w:after="30"/>
       </w:pPr>
       <w:r>
         <w:rPr>
           <w:rFonts w:ascii="Calibri" w:hAnsi="Calibri"/>
           <w:b/>
-          <w:sz w:val="22"/>
+          <w:sz w:val="21"/>
         </w:rPr>
         <w:t xml:space="preserve">• Organización Mundial de la Salud (OMS): </w:t>
       </w:r>
@@ -1071,22 +1030,22 @@
         <w:r>
           <w:rPr>
             <w:rFonts w:ascii="Calibri" w:hAnsi="Calibri"/>
-            <w:color w:val="00A896"/>
+            <w:color w:val="0B7285"/>
             <w:u w:val="single"/>
           </w:rPr>
-          <w:t>Adherencia a los tratamientos a largo plazo: pruebas para la acción (Enlace web)</w:t>
+          <w:t>Informe sobre adherencia a los tratamientos a largo plazo (Enlace web)</w:t>
         </w:r>
       </w:hyperlink>
     </w:p>
     <w:p>
       <w:pPr>
-        <w:spacing w:line="276" w:lineRule="auto" w:after="40"/>
+        <w:spacing w:line="276" w:lineRule="auto" w:after="30"/>
       </w:pPr>
       <w:r>
         <w:rPr>
           <w:rFonts w:ascii="Calibri" w:hAnsi="Calibri"/>
           <w:b/>
-          <w:sz w:val="22"/>
+          <w:sz w:val="21"/>
         </w:rPr>
         <w:t xml:space="preserve">• Sociedad Española de Geriatría y Gerontología (SEGG): </w:t>
       </w:r>
@@ -1094,33 +1053,33 @@
         <w:r>
           <w:rPr>
             <w:rFonts w:ascii="Calibri" w:hAnsi="Calibri"/>
-            <w:color w:val="00A896"/>
+            <w:color w:val="0B7285"/>
             <w:u w:val="single"/>
           </w:rPr>
-          <w:t>Guías de buena práctica clínica en polimedicación y personas mayores (Enlace web)</w:t>
+          <w:t>Guía de buena práctica clínica en polimedicación en el anciano (Enlace web)</w:t>
         </w:r>
       </w:hyperlink>
     </w:p>
     <w:p>
       <w:pPr>
-        <w:spacing w:line="276" w:lineRule="auto" w:after="40"/>
+        <w:spacing w:line="276" w:lineRule="auto" w:after="30"/>
       </w:pPr>
       <w:r>
         <w:rPr>
           <w:rFonts w:ascii="Calibri" w:hAnsi="Calibri"/>
           <w:b/>
-          <w:sz w:val="22"/>
+          <w:sz w:val="21"/>
         </w:rPr>
-        <w:t xml:space="preserve">• Naciones Unidas (ODS): </w:t>
+        <w:t xml:space="preserve">• Naciones Unidas: </w:t>
       </w:r>
       <w:hyperlink r:id="rId15" w:history="1">
         <w:r>
           <w:rPr>
             <w:rFonts w:ascii="Calibri" w:hAnsi="Calibri"/>
-            <w:color w:val="00A896"/>
+            <w:color w:val="0B7285"/>
             <w:u w:val="single"/>
           </w:rPr>
-          <w:t>Objetivo 3: Salud y Bienestar y Objetivo 10: Reducción de las Desigualdades (Enlace web)</w:t>
+          <w:t>Objetivo de Desarrollo Sostenible 3: Salud y Bienestar (Enlace web)</w:t>
         </w:r>
       </w:hyperlink>
     </w:p>
@@ -1128,7 +1087,7 @@
       <w:headerReference w:type="default" r:id="rId9"/>
       <w:footerReference w:type="default" r:id="rId10"/>
       <w:pgSz w:w="11909" w:h="16834"/>
-      <w:pgMar w:top="1224" w:right="1224" w:bottom="1224" w:left="1224" w:header="720" w:footer="720" w:gutter="0"/>
+      <w:pgMar w:top="1152" w:right="1224" w:bottom="1152" w:left="1224" w:header="720" w:footer="720" w:gutter="0"/>
       <w:cols w:space="720"/>
       <w:titlePg/>
       <w:docGrid w:linePitch="360"/>
@@ -1147,10 +1106,10 @@
     <w:r>
       <w:rPr>
         <w:rFonts w:ascii="Calibri" w:hAnsi="Calibri"/>
-        <w:color w:val="64748B"/>
+        <w:color w:val="78909C"/>
         <w:sz w:val="18"/>
       </w:rPr>
-      <w:t>Memorix  •  Propuesta Inicial</w:t>
+      <w:t>Memorix  •  Kevin Muñoz Córcoles</w:t>
       <w:tab/>
       <w:tab/>
       <w:t xml:space="preserve">Página </w:t>
@@ -1158,7 +1117,7 @@
     <w:r>
       <w:rPr>
         <w:rFonts w:ascii="Calibri" w:hAnsi="Calibri"/>
-        <w:color w:val="64748B"/>
+        <w:color w:val="78909C"/>
         <w:sz w:val="18"/>
       </w:rPr>
       <w:fldChar w:fldCharType="begin"/>
@@ -1180,8 +1139,8 @@
     <w:r>
       <w:rPr>
         <w:rFonts w:ascii="Calibri" w:hAnsi="Calibri"/>
-        <w:color w:val="64748B"/>
-        <w:sz w:val="17"/>
+        <w:color w:val="78909C"/>
+        <w:sz w:val="18"/>
       </w:rPr>
       <w:t>Proyecto Intermodular - 2º DAM  |  Tarea 0: Memorix</w:t>
     </w:r>
@@ -1553,11 +1512,11 @@
     <w:qFormat/>
     <w:rsid w:val="00FC693F"/>
     <w:pPr>
-      <w:spacing w:line="360" w:lineRule="auto" w:after="80"/>
+      <w:spacing w:line="360" w:lineRule="auto" w:after="60"/>
     </w:pPr>
     <w:rPr>
       <w:rFonts w:ascii="Calibri" w:hAnsi="Calibri"/>
-      <w:color w:val="1E293B"/>
+      <w:color w:val="232F3E"/>
       <w:sz w:val="24"/>
     </w:rPr>
   </w:style>

</xml_diff>